<commit_message>
powerapps: 투어 가이드 배정 화면(scrGuides) 추가
- 달력 + 배정 패널(인솔자 복수 · 운영 인원 복수/전체), 주간 배정표(오전 · 오후 · 시간 미정 + 가동률), 월간 · 연간 가이드별 M/M
- 저장은 VisitRequests.Guides (웹 시트 가이드 열과 같은 형식), 명단은 SharePoint GuideRoster 목록 [PA 전용]
- 8개 화면 머리말 관리자 묶음에 '가이드 배정' 탭 (main 관리자만)
- GuideRoster.csv · provision.ps1 · OnStart · README(구축 순서 · 테스트 · 14절) · FUNCTION-SPEC F-05 갱신
- 목업 가이드 배정 화면, to-be 이미지, 수정 요청서 F-05 갱신

Co-Authored-By: Claude Opus 5.5 <noreply@anthropic.com>
Claude-Session: https://claude.ai/code/session_01Qyo4Wj8BdQ4BoTLnfUsHQ5
</commit_message>
<xml_diff>
--- a/powerapps/변경요청서_PowerApps_20261029.docx
+++ b/powerapps/변경요청서_PowerApps_20261029.docx
@@ -63,7 +63,7 @@
         </w:numPr>
       </w:pPr>
       <w:r>
-        <w:t xml:space="preserve">운영 전 필수(상) 19건, 나머지(중 · 하)는 운영 후 보완 가능</w:t>
+        <w:t xml:space="preserve">운영 전 필수(상) 20건, 나머지(중 · 하)는 운영 후 보완 가능</w:t>
       </w:r>
     </w:p>
     <w:p>
@@ -477,7 +477,7 @@
           <w:p>
             <w:pPr/>
             <w:r>
-              <w:t xml:space="preserve">관리자 메뉴 구분: 관리자 메뉴(예약 관리 · 달력 · 통계 · 방명록 관리)를 오른쪽에 따로 묶고 빨간 '관리자' 표시 + 옅은 바탕으로 구분. 관리자에게만 보임. 기존 '관리자' 탭 이름은 '예약 관리'로 변경</w:t>
+              <w:t xml:space="preserve">관리자 메뉴 구분: 관리자 메뉴(예약 관리 · 달력 · 통계 · 가이드 배정 · 방명록 관리)를 오른쪽에 따로 묶고 빨간 '관리자' 표시 + 옅은 바탕으로 구분. 관리자에게만 보임. 기존 '관리자' 탭 이름은 '예약 관리'로 변경</w:t>
             </w:r>
           </w:p>
         </w:tc>
@@ -1611,7 +1611,7 @@
     <w:p>
       <w:pPr/>
       <w:r>
-        <w:t xml:space="preserve">N-1 ~ N-3 · F-06 은 코드가 첨부 자료에 있음. F-01 ~ F-05 는 새로 개발(상세는 FUNCTION-SPEC.md 3장).</w:t>
+        <w:t xml:space="preserve">N-1 ~ N-3 · F-05 · F-06 은 코드가 첨부 자료에 있음. F-01 ~ F-04 는 새로 개발(상세는 FUNCTION-SPEC.md 3장).</w:t>
       </w:r>
     </w:p>
     <w:tbl>
@@ -2067,7 +2067,7 @@
           <w:p>
             <w:pPr/>
             <w:r>
-              <w:t xml:space="preserve">투어 가이드(인솔자) 배정 메뉴</w:t>
+              <w:t xml:space="preserve">투어 가이드 배정 메뉴: 달력 + 배정 패널, 주간 배정표, 월간 · 연간 가이드별 M/M (아래 그림)</w:t>
             </w:r>
           </w:p>
         </w:tc>
@@ -2078,7 +2078,7 @@
           <w:p>
             <w:pPr/>
             <w:r>
-              <w:t xml:space="preserve">개발</w:t>
+              <w:t xml:space="preserve">scrGuides.yaml</w:t>
             </w:r>
           </w:p>
         </w:tc>
@@ -2089,7 +2089,7 @@
           <w:p>
             <w:pPr/>
             <w:r>
-              <w:t xml:space="preserve">중</w:t>
+              <w:t xml:space="preserve">상</w:t>
             </w:r>
           </w:p>
         </w:tc>
@@ -2205,6 +2205,50 @@
     </w:p>
     <w:p>
       <w:pPr>
+        <w:pStyle w:val="Heading3"/>
+      </w:pPr>
+      <w:r>
+        <w:t xml:space="preserve">투어 가이드 배정 (F-05)</w:t>
+      </w:r>
+    </w:p>
+    <w:p>
+      <w:pPr/>
+      <w:r>
+        <w:drawing>
+          <wp:inline distT="0" distB="0" distL="0" distR="0">
+            <wp:extent cx="4524018" cy="7498080"/>
+            <wp:docPr id="11" name="image11" descr="투어 가이드 배정 화면 (한 화면 세로 스크롤)"/>
+            <a:graphic xmlns:a="http://schemas.openxmlformats.org/drawingml/2006/main">
+              <a:graphicData uri="http://schemas.openxmlformats.org/drawingml/2006/picture">
+                <pic:pic xmlns:pic="http://schemas.openxmlformats.org/drawingml/2006/picture">
+                  <pic:nvPicPr>
+                    <pic:cNvPr id="11" name="image11" descr="투어 가이드 배정 화면 (한 화면 세로 스크롤)"/>
+                    <pic:cNvPicPr/>
+                  </pic:nvPicPr>
+                  <pic:blipFill>
+                    <a:blip r:embed="rId13"/>
+                    <a:stretch>
+                      <a:fillRect/>
+                    </a:stretch>
+                  </pic:blipFill>
+                  <pic:spPr>
+                    <a:xfrm>
+                      <a:off x="0" y="0"/>
+                      <a:ext cx="4524018" cy="7498080"/>
+                    </a:xfrm>
+                    <a:prstGeom prst="rect">
+                      <a:avLst/>
+                    </a:prstGeom>
+                  </pic:spPr>
+                </pic:pic>
+              </a:graphicData>
+            </a:graphic>
+          </wp:inline>
+        </w:drawing>
+      </w:r>
+    </w:p>
+    <w:p>
+      <w:pPr>
         <w:pStyle w:val="ListParagraph"/>
         <w:numPr>
           <w:ilvl w:val="0"/>
@@ -2212,15 +2256,97 @@
         </w:numPr>
       </w:pPr>
       <w:r>
-        <w:t xml:space="preserve">방명록 개인정보: 실명 원본은 관리자만, 화면에는 가명(홍** · L**)만 표시(웹과 동일)</w:t>
-      </w:r>
-    </w:p>
-    <w:p>
-      <w:pPr>
-        <w:pStyle w:val="Heading3"/>
-      </w:pPr>
-      <w:r>
-        <w:t xml:space="preserve">데이터 · 흐름 변경</w:t>
+        <w:t xml:space="preserve">위치: 관리자 메뉴 묶음의 [가이드 배정] 탭. 메가와이즈 · TDL Lab 관리자(main)만 보임</w:t>
+      </w:r>
+    </w:p>
+    <w:p>
+      <w:pPr>
+        <w:pStyle w:val="ListParagraph"/>
+        <w:numPr>
+          <w:ilvl w:val="0"/>
+          <w:numId w:val="5"/>
+        </w:numPr>
+      </w:pPr>
+      <w:r>
+        <w:t xml:space="preserve">배정 대상: 승인 · 완료된 방문 중 TDL Lab 이 들어간 투어(메가와이즈 센터만 도는 투어는 제외)</w:t>
+      </w:r>
+    </w:p>
+    <w:p>
+      <w:pPr>
+        <w:pStyle w:val="ListParagraph"/>
+        <w:numPr>
+          <w:ilvl w:val="0"/>
+          <w:numId w:val="5"/>
+        </w:numPr>
+      </w:pPr>
+      <w:r>
+        <w:t xml:space="preserve">달력 + 배정 패널: 칩을 눌러 인솔자(복수) · 운영 인원(복수, 전체 선택) 저장. 인솔자 미배정은 빨간 점선</w:t>
+      </w:r>
+    </w:p>
+    <w:p>
+      <w:pPr>
+        <w:pStyle w:val="ListParagraph"/>
+        <w:numPr>
+          <w:ilvl w:val="0"/>
+          <w:numId w:val="5"/>
+        </w:numPr>
+      </w:pPr>
+      <w:r>
+        <w:t xml:space="preserve">주간 배정표: 월~일 × 오전 · 오후 · 시간 미정, 이 주 인원별 가동률</w:t>
+      </w:r>
+    </w:p>
+    <w:p>
+      <w:pPr>
+        <w:pStyle w:val="ListParagraph"/>
+        <w:numPr>
+          <w:ilvl w:val="0"/>
+          <w:numId w:val="5"/>
+        </w:numPr>
+      </w:pPr>
+      <w:r>
+        <w:t xml:space="preserve">월간 M/M: 사람별 인솔 · 운영 · 투입 시간 · M/M (1건 = 4시간, 근무일 × 8시간 = 1 M/M)</w:t>
+      </w:r>
+    </w:p>
+    <w:p>
+      <w:pPr>
+        <w:pStyle w:val="ListParagraph"/>
+        <w:numPr>
+          <w:ilvl w:val="0"/>
+          <w:numId w:val="5"/>
+        </w:numPr>
+      </w:pPr>
+      <w:r>
+        <w:t xml:space="preserve">연간 M/M: 사람 × 월 표, 값이 클수록 진하게</w:t>
+      </w:r>
+    </w:p>
+    <w:p>
+      <w:pPr>
+        <w:pStyle w:val="ListParagraph"/>
+        <w:numPr>
+          <w:ilvl w:val="0"/>
+          <w:numId w:val="5"/>
+        </w:numPr>
+      </w:pPr>
+      <w:r>
+        <w:t xml:space="preserve">명단은 SharePoint </w:t>
+      </w:r>
+      <w:r>
+        <w:rPr>
+          <w:rStyle w:val="CodeChar"/>
+        </w:rPr>
+        <w:t xml:space="preserve">GuideRoster</w:t>
+      </w:r>
+      <w:r>
+        <w:t xml:space="preserve"> 목록(인사 이동 때 목록만 수정), 배정은 </w:t>
+      </w:r>
+      <w:r>
+        <w:rPr>
+          <w:rStyle w:val="CodeChar"/>
+        </w:rPr>
+        <w:t xml:space="preserve">VisitRequests.Guides</w:t>
+      </w:r>
+      <w:r>
+        <w:t xml:space="preserve"> 에 저장(웹 시트 '가이드' 열과 같은 형식)</w:t>
       </w:r>
     </w:p>
     <w:p>
@@ -2232,63 +2358,15 @@
         </w:numPr>
       </w:pPr>
       <w:r>
-        <w:t xml:space="preserve">SharePoint 목록 신규 3개: Guestbook(관리자만) · GuestbookPublic(전 직원 읽기) · CenterGuides</w:t>
-      </w:r>
-    </w:p>
-    <w:p>
-      <w:pPr>
-        <w:pStyle w:val="ListParagraph"/>
-        <w:numPr>
-          <w:ilvl w:val="0"/>
-          <w:numId w:val="6"/>
-        </w:numPr>
-      </w:pPr>
-      <w:r>
-        <w:t xml:space="preserve">VisitRequests 열 추가: FeedbackMailAt (F-02 진행 시 PartnerName, F-05 진행 시 Guides)</w:t>
-      </w:r>
-    </w:p>
-    <w:p>
-      <w:pPr>
-        <w:pStyle w:val="ListParagraph"/>
-        <w:numPr>
-          <w:ilvl w:val="0"/>
-          <w:numId w:val="6"/>
-        </w:numPr>
-      </w:pPr>
-      <w:r>
-        <w:t xml:space="preserve">흐름 수정: C(완료 메일 · 오시는 길 · 취소 메일 분리), D(1년 지난 방명록 삭제)</w:t>
-      </w:r>
-    </w:p>
-    <w:p>
-      <w:pPr>
-        <w:pStyle w:val="ListParagraph"/>
-        <w:numPr>
-          <w:ilvl w:val="0"/>
-          <w:numId w:val="6"/>
-        </w:numPr>
-      </w:pPr>
-      <w:r>
-        <w:t xml:space="preserve">흐름 신규: E(앱 방명록 등록) · F(Forms 방명록) · G(가명 처리), 관리자 계정으로 생성</w:t>
-      </w:r>
-    </w:p>
-    <w:p>
-      <w:pPr>
-        <w:pStyle w:val="ListParagraph"/>
-        <w:numPr>
-          <w:ilvl w:val="0"/>
-          <w:numId w:val="6"/>
-        </w:numPr>
-      </w:pPr>
-      <w:r>
-        <w:t xml:space="preserve">설정 순서는 README.md · 4-power-automate/flows.md</w:t>
-      </w:r>
-    </w:p>
-    <w:p>
-      <w:pPr>
-        <w:pStyle w:val="Heading2"/>
-      </w:pPr>
-      <w:r>
-        <w:t xml:space="preserve">5. 확인 부탁</w:t>
+        <w:t xml:space="preserve">방명록 개인정보: 실명 원본은 관리자만, 화면에는 가명(홍** · L**)만 표시(웹과 동일)</w:t>
+      </w:r>
+    </w:p>
+    <w:p>
+      <w:pPr>
+        <w:pStyle w:val="Heading3"/>
+      </w:pPr>
+      <w:r>
+        <w:t xml:space="preserve">데이터 · 흐름 변경</w:t>
       </w:r>
     </w:p>
     <w:p>
@@ -2300,7 +2378,55 @@
         </w:numPr>
       </w:pPr>
       <w:r>
-        <w:t xml:space="preserve">FUNCTION-SPEC.md 의 P-01 ~ P-12(본문 스크롤, 동시 신청 방지, 연속 클릭 잠금, 메일 실패 경고 등) 중 이미 반영된 항목 회신</w:t>
+        <w:t xml:space="preserve">SharePoint 목록 신규 3개: Guestbook(관리자만) · GuestbookPublic(전 직원 읽기) · CenterGuides</w:t>
+      </w:r>
+    </w:p>
+    <w:p>
+      <w:pPr>
+        <w:pStyle w:val="ListParagraph"/>
+        <w:numPr>
+          <w:ilvl w:val="0"/>
+          <w:numId w:val="7"/>
+        </w:numPr>
+      </w:pPr>
+      <w:r>
+        <w:t xml:space="preserve">VisitRequests 열 추가: FeedbackMailAt (F-02 진행 시 PartnerName, F-05 진행 시 Guides)</w:t>
+      </w:r>
+    </w:p>
+    <w:p>
+      <w:pPr>
+        <w:pStyle w:val="ListParagraph"/>
+        <w:numPr>
+          <w:ilvl w:val="0"/>
+          <w:numId w:val="7"/>
+        </w:numPr>
+      </w:pPr>
+      <w:r>
+        <w:t xml:space="preserve">흐름 수정: C(완료 메일 · 오시는 길 · 취소 메일 분리), D(1년 지난 방명록 삭제)</w:t>
+      </w:r>
+    </w:p>
+    <w:p>
+      <w:pPr>
+        <w:pStyle w:val="ListParagraph"/>
+        <w:numPr>
+          <w:ilvl w:val="0"/>
+          <w:numId w:val="7"/>
+        </w:numPr>
+      </w:pPr>
+      <w:r>
+        <w:t xml:space="preserve">흐름 신규: E(앱 방명록 등록) · F(Forms 방명록) · G(가명 처리), 관리자 계정으로 생성</w:t>
+      </w:r>
+    </w:p>
+    <w:p>
+      <w:pPr>
+        <w:pStyle w:val="ListParagraph"/>
+        <w:numPr>
+          <w:ilvl w:val="0"/>
+          <w:numId w:val="7"/>
+        </w:numPr>
+      </w:pPr>
+      <w:r>
+        <w:t xml:space="preserve">설정 순서는 README.md · 4-power-automate/flows.md</w:t>
       </w:r>
     </w:p>
     <w:p>
@@ -2308,13 +2434,7 @@
         <w:pStyle w:val="Heading2"/>
       </w:pPr>
       <w:r>
-        <w:t xml:space="preserve">6. 첨부</w:t>
-      </w:r>
-    </w:p>
-    <w:p>
-      <w:pPr/>
-      <w:r>
-        <w:t xml:space="preserve">ZIP 의 powerapps 폴더 기준.</w:t>
+        <w:t xml:space="preserve">5. 확인 부탁</w:t>
       </w:r>
     </w:p>
     <w:p>
@@ -2326,7 +2446,21 @@
         </w:numPr>
       </w:pPr>
       <w:r>
-        <w:t xml:space="preserve">mockup/to-be/: 이 문서 그림 10장</w:t>
+        <w:t xml:space="preserve">FUNCTION-SPEC.md 의 P-01 ~ P-12(본문 스크롤, 동시 신청 방지, 연속 클릭 잠금, 메일 실패 경고 등) 중 이미 반영된 항목 회신</w:t>
+      </w:r>
+    </w:p>
+    <w:p>
+      <w:pPr>
+        <w:pStyle w:val="Heading2"/>
+      </w:pPr>
+      <w:r>
+        <w:t xml:space="preserve">6. 첨부</w:t>
+      </w:r>
+    </w:p>
+    <w:p>
+      <w:pPr/>
+      <w:r>
+        <w:t xml:space="preserve">ZIP 의 powerapps 폴더 기준.</w:t>
       </w:r>
     </w:p>
     <w:p>
@@ -2334,11 +2468,11 @@
         <w:pStyle w:val="ListParagraph"/>
         <w:numPr>
           <w:ilvl w:val="0"/>
-          <w:numId w:val="8"/>
+          <w:numId w:val="9"/>
         </w:numPr>
       </w:pPr>
       <w:r>
-        <w:t xml:space="preserve">mockup/index.html: 화면 시안(브라우저로 열기, 주소 끝에 #adm+to 를 붙이면 번호 표시, #b1+emp 는 관리자 아닌 임직원 화면)</w:t>
+        <w:t xml:space="preserve">mockup/to-be/: 이 문서 그림 11장</w:t>
       </w:r>
     </w:p>
     <w:p>
@@ -2346,11 +2480,11 @@
         <w:pStyle w:val="ListParagraph"/>
         <w:numPr>
           <w:ilvl w:val="0"/>
-          <w:numId w:val="8"/>
+          <w:numId w:val="9"/>
         </w:numPr>
       </w:pPr>
       <w:r>
-        <w:t xml:space="preserve">3-powerapps/: 화면 YAML 8개 · App.Formulas.txt · App.OnStart.txt (화면 단위로 교체 권장)</w:t>
+        <w:t xml:space="preserve">mockup/index.html: 화면 시안(브라우저로 열기, 주소 끝에 #adm+to 를 붙이면 번호 표시, #b1+emp 는 관리자 아닌 임직원 화면)</w:t>
       </w:r>
     </w:p>
     <w:p>
@@ -2358,11 +2492,11 @@
         <w:pStyle w:val="ListParagraph"/>
         <w:numPr>
           <w:ilvl w:val="0"/>
-          <w:numId w:val="8"/>
+          <w:numId w:val="9"/>
         </w:numPr>
       </w:pPr>
       <w:r>
-        <w:t xml:space="preserve">1-sharepoint/ · 2-forms/ · 4-power-automate/: 목록 CSV, Forms, 흐름 · 메일 본문</w:t>
+        <w:t xml:space="preserve">3-powerapps/: 화면 YAML 8개 · App.Formulas.txt · App.OnStart.txt (화면 단위로 교체 권장)</w:t>
       </w:r>
     </w:p>
     <w:p>
@@ -2370,11 +2504,11 @@
         <w:pStyle w:val="ListParagraph"/>
         <w:numPr>
           <w:ilvl w:val="0"/>
-          <w:numId w:val="8"/>
+          <w:numId w:val="9"/>
         </w:numPr>
       </w:pPr>
       <w:r>
-        <w:t xml:space="preserve">README.md · FUNCTION-SPEC.md: 구축 순서, 기능별 상세 규칙</w:t>
+        <w:t xml:space="preserve">1-sharepoint/ · 2-forms/ · 4-power-automate/: 목록 CSV, Forms, 흐름 · 메일 본문</w:t>
       </w:r>
     </w:p>
     <w:p>
@@ -2382,7 +2516,19 @@
         <w:pStyle w:val="ListParagraph"/>
         <w:numPr>
           <w:ilvl w:val="0"/>
-          <w:numId w:val="8"/>
+          <w:numId w:val="9"/>
+        </w:numPr>
+      </w:pPr>
+      <w:r>
+        <w:t xml:space="preserve">README.md · FUNCTION-SPEC.md: 구축 순서, 기능별 상세 규칙</w:t>
+      </w:r>
+    </w:p>
+    <w:p>
+      <w:pPr>
+        <w:pStyle w:val="ListParagraph"/>
+        <w:numPr>
+          <w:ilvl w:val="0"/>
+          <w:numId w:val="9"/>
         </w:numPr>
       </w:pPr>
       <w:r>
@@ -2589,6 +2735,9 @@
     <w:abstractNumId w:val="0"/>
   </w:num>
   <w:num w:numId="8">
+    <w:abstractNumId w:val="0"/>
+  </w:num>
+  <w:num w:numId="9">
     <w:abstractNumId w:val="0"/>
   </w:num>
 </w:numbering>

</xml_diff>